<commit_message>
Actualizacion mié. 30/09/2026 14:18:19,17
</commit_message>
<xml_diff>
--- a/documentacion/manual_vincular_por_bloques.docx
+++ b/documentacion/manual_vincular_por_bloques.docx
@@ -423,43 +423,43 @@
           <w:sz w:val="30"/>
           <w:szCs w:val="30"/>
         </w:rPr>
-        <w:t xml:space="preserve">4. Movimientos en Bolsa, Bolsón u otra unidad: equivalencias en Kg</w:t>
-      </w:r>
-    </w:p>
-    <w:p>
-      <w:pPr>
-        <w:spacing w:after="160" w:line="300"/>
-      </w:pPr>
-      <w:r>
-        <w:rPr>
-          <w:sz w:val="22"/>
-          <w:szCs w:val="22"/>
-        </w:rPr>
-        <w:t xml:space="preserve">Un renglón de comprobante fiscal siempre factura en Kilogramos — nunca puede estar cargado en Bolsa o Bolsón, porque esas unidades no son unidades fiscales válidas para AFIP. Pero un movimiento (lo que se carga en báscula o planilla) sí puede quedar cargado en Bolsa o Bolsón, según cómo se manejó ese producto puntual.</w:t>
-      </w:r>
-    </w:p>
-    <w:p>
-      <w:pPr>
-        <w:spacing w:after="160" w:line="300"/>
-      </w:pPr>
-      <w:r>
-        <w:rPr>
-          <w:sz w:val="22"/>
-          <w:szCs w:val="22"/>
-        </w:rPr>
-        <w:t xml:space="preserve">Antes, si un movimiento estaba en una unidad distinta de Kg, “Vincular por bloques” no lo encontraba nunca del lado de los renglones (que siempre están en Kg) — parecía que la pantalla “no encontraba nada” para ese producto, aunque el movimiento y el comprobante existieran los dos.</w:t>
-      </w:r>
-    </w:p>
-    <w:p>
-      <w:pPr>
-        <w:spacing w:after="160" w:line="300"/>
-      </w:pPr>
-      <w:r>
-        <w:rPr>
-          <w:sz w:val="22"/>
-          <w:szCs w:val="22"/>
-        </w:rPr>
-        <w:t xml:space="preserve">Ahora existe una pantalla, “Equivalencias de unidades” (en el mismo menú de “Cuenta corriente de productos”), donde se carga cuántos Kg equivale 1 unidad de Bolsa (o Bolsón, o la que corresponda) para un producto puntual. Una vez cargada esa equivalencia:</w:t>
+        <w:t xml:space="preserve">4. Movimientos o renglones en Bolsa, Bolsón, Unidad, etc.: equivalencias en Kg</w:t>
+      </w:r>
+    </w:p>
+    <w:p>
+      <w:pPr>
+        <w:spacing w:after="160" w:line="300"/>
+      </w:pPr>
+      <w:r>
+        <w:rPr>
+          <w:sz w:val="22"/>
+          <w:szCs w:val="22"/>
+        </w:rPr>
+        <w:t xml:space="preserve">Un movimiento (lo que se carga en báscula o planilla) puede quedar cargado en cualquier unidad — Kg, Bolsa, Bolsón, etc. Un renglón de comprobante fiscal TAMBIÉN puede estar facturado en distintas unidades válidas para AFIP (Kg, Unidad, etc.) — lo único que un renglón fiscal nunca puede usar es Bolsa o Bolsón, porque esas dos son exclusivas de movimientos y remitos, no unidades fiscales reales.</w:t>
+      </w:r>
+    </w:p>
+    <w:p>
+      <w:pPr>
+        <w:spacing w:after="160" w:line="300"/>
+      </w:pPr>
+      <w:r>
+        <w:rPr>
+          <w:sz w:val="22"/>
+          <w:szCs w:val="22"/>
+        </w:rPr>
+        <w:t xml:space="preserve">El problema aparece cuando el movimiento y el renglón que lo factura quedan en unidades distintas entre sí (por ejemplo, un movimiento en Bolsa contra un renglón en Kg, o un movimiento en Kg contra un renglón facturado en Unidad): antes, “Vincular por bloques” exigía que los dos lados coincidieran exactamente, así que ese movimiento y ese renglón nunca se veían juntos — parecía que la pantalla “no encontraba nada” para ese producto, aunque los dos existieran.</w:t>
+      </w:r>
+    </w:p>
+    <w:p>
+      <w:pPr>
+        <w:spacing w:after="160" w:line="300"/>
+      </w:pPr>
+      <w:r>
+        <w:rPr>
+          <w:sz w:val="22"/>
+          <w:szCs w:val="22"/>
+        </w:rPr>
+        <w:t xml:space="preserve">Ahora existe una pantalla, “Equivalencias de unidades” (en el mismo menú de “Cuenta corriente de productos”), donde se carga cuántos Kg equivale 1 unidad de esa otra unidad (Bolsa, Bolsón, Unidad, etc.) para un producto puntual. Una vez cargada esa equivalencia, se aplica automáticamente a CUALQUIER lado que esté en esa unidad — el movimiento, el renglón, o los dos:</w:t>
       </w:r>
     </w:p>
     <w:p>
@@ -476,7 +476,7 @@
           <w:sz w:val="22"/>
           <w:szCs w:val="22"/>
         </w:rPr>
-        <w:t xml:space="preserve">“Vincular por bloques” trae también los movimientos de ese producto que están en esa unidad (se ve una columna “Unidad” en la tabla), convertidos a Kg, y permite vincularlos contra un renglón en Kg como a cualquier otro.</w:t>
+        <w:t xml:space="preserve">“Vincular por bloques” trae también los movimientos y los renglones de ese producto que estén en esa unidad (se ve una columna “Unidad” en cada tabla), convertidos a Kg, y permite vincularlos entre sí sin importar en qué unidad esté cargado cada lado.</w:t>
       </w:r>
     </w:p>
     <w:p>
@@ -493,7 +493,7 @@
           <w:sz w:val="22"/>
           <w:szCs w:val="22"/>
         </w:rPr>
-        <w:t xml:space="preserve">“Pendientes por producto” junta esos movimientos con los que ya estaban en Kg en una sola fila, en vez de mostrar una fila aparte para “Bolsa” con un número que en realidad ya está convertido.</w:t>
+        <w:t xml:space="preserve">“Pendientes por producto” junta todo lo que tenga equivalencia cargada con lo que ya estaba en Kg en una sola fila, en vez de mostrar una fila aparte (por ejemplo “Unidad”) con un número que en realidad ya está convertido.</w:t>
       </w:r>
     </w:p>
     <w:p>
@@ -594,7 +594,7 @@
           <w:sz w:val="22"/>
           <w:szCs w:val="22"/>
         </w:rPr>
-        <w:t xml:space="preserve">Elegir la unidad que no es Kg (Bolsa, Bolsón, etc.).</w:t>
+        <w:t xml:space="preserve">Elegir la unidad que no es Kg (Bolsa, Bolsón, Unidad, etc.).</w:t>
       </w:r>
     </w:p>
     <w:p>
@@ -623,7 +623,7 @@
           <w:sz w:val="22"/>
           <w:szCs w:val="22"/>
         </w:rPr>
-        <w:t xml:space="preserve">Desde esa misma pantalla se puede editar o eliminar una equivalencia ya cargada. No se puede cargar dos veces la misma combinación producto + unidad (el sistema avisa si ya existe).</w:t>
+        <w:t xml:space="preserve">Desde esa misma pantalla se puede editar o eliminar una equivalencia ya cargada. No se puede cargar dos veces la misma combinación producto + unidad (el sistema avisa si ya existe). Un mismo producto puede tener varias equivalencias, una por cada unidad distinta que use (por ejemplo, Bolsa Y Unidad al mismo tiempo).</w:t>
       </w:r>
     </w:p>
     <w:p>
@@ -639,19 +639,31 @@
           <w:sz w:val="25"/>
           <w:szCs w:val="25"/>
         </w:rPr>
-        <w:t xml:space="preserve">Ejemplo real: YERBA MATE “LA HUELLA” 4x2Kg (producto 1088)</w:t>
-      </w:r>
-    </w:p>
-    <w:p>
-      <w:pPr>
-        <w:spacing w:after="160" w:line="300"/>
-      </w:pPr>
-      <w:r>
-        <w:rPr>
-          <w:sz w:val="22"/>
-          <w:szCs w:val="22"/>
-        </w:rPr>
-        <w:t xml:space="preserve">Este producto se cargaba en movimientos usando la unidad “Bolsa”, mientras que los comprobantes que lo facturan están, como todos, en Kg. Con la equivalencia cargada (1 Bolsa = 8 Kg), “Vincular por bloques” vuelve a encontrar esos movimientos junto con el renglón correspondiente, y los convierte automáticamente al vincularlos.</w:t>
+        <w:t xml:space="preserve">Ejemplos reales: YERBA MATE “LA HUELLA” 4x2Kg (producto 1088)</w:t>
+      </w:r>
+    </w:p>
+    <w:p>
+      <w:pPr>
+        <w:spacing w:after="160" w:line="300"/>
+      </w:pPr>
+      <w:r>
+        <w:rPr>
+          <w:sz w:val="22"/>
+          <w:szCs w:val="22"/>
+        </w:rPr>
+        <w:t xml:space="preserve">Caso 1 — movimiento en otra unidad: este producto se cargaba en movimientos usando la unidad “Bolsa”, mientras que el comprobante que lo factura está en Kg. Con la equivalencia cargada (1 Bolsa = 8 Kg), “Vincular por bloques” vuelve a encontrar ese movimiento junto con el renglón correspondiente, y los convierte automáticamente al vincularlos.</w:t>
+      </w:r>
+    </w:p>
+    <w:p>
+      <w:pPr>
+        <w:spacing w:after="160" w:line="300"/>
+      </w:pPr>
+      <w:r>
+        <w:rPr>
+          <w:sz w:val="22"/>
+          <w:szCs w:val="22"/>
+        </w:rPr>
+        <w:t xml:space="preserve">Caso 2 — renglón en otra unidad: para el mismo producto, con otro proveedor, el comprobante que lo factura está en “Unidad” (por bulto) en vez de Kg, mientras que el movimiento está en Kg. Con una equivalencia distinta cargada para esa combinación (por ejemplo, 1 Unidad = 9 Kg), “Vincular por bloques” convierte esta vez el lado del renglón, y vuelve a poder vincularlo contra el movimiento en Kg.</w:t>
       </w:r>
     </w:p>
     <w:p>
@@ -682,7 +694,7 @@
           <w:sz w:val="21"/>
           <w:szCs w:val="21"/>
         </w:rPr>
-        <w:t xml:space="preserve">Si en algún momento vuelve a pasar que la pantalla “no encuentra nada” para un producto que sí tiene movimientos y comprobantes cargados, lo primero para revisar es si ese producto se está usando con una unidad distinta de Kg en los movimientos — y, si corresponde, cargarle su equivalencia acá.</w:t>
+        <w:t xml:space="preserve">Si en algún momento vuelve a pasar que la pantalla “no encuentra nada” para un producto que sí tiene movimientos y comprobantes cargados, lo primero para revisar es si alguno de los dos lados (movimiento O renglón) está en una unidad distinta de Kg — y, si corresponde, cargarle su equivalencia acá.</w:t>
       </w:r>
     </w:p>
     <w:p>
@@ -1029,7 +1041,7 @@
                 <w:sz w:val="20"/>
                 <w:szCs w:val="20"/>
               </w:rPr>
-              <w:t xml:space="preserve">Unidad en la que está cargado ese movimiento (Kg, Bolsa, Bolsón, etc.). Si no es Kg y el producto tiene equivalencia cargada, se muestra también el equivalente en Kg.</w:t>
+              <w:t xml:space="preserve">Unidad en la que está cargado ese movimiento o facturado ese renglón (Kg, Bolsa, Bolsón, Unidad, etc.). Si no es Kg y el producto tiene equivalencia cargada para esa unidad, se muestra también el equivalente en Kg.</w:t>
             </w:r>
           </w:p>
         </w:tc>
@@ -1121,19 +1133,19 @@
           <w:sz w:val="25"/>
           <w:szCs w:val="25"/>
         </w:rPr>
-        <w:t xml:space="preserve">¿Por qué un movimiento no aparece en la lista de pendientes?</w:t>
-      </w:r>
-    </w:p>
-    <w:p>
-      <w:pPr>
-        <w:spacing w:after="160" w:line="300"/>
-      </w:pPr>
-      <w:r>
-        <w:rPr>
-          <w:sz w:val="22"/>
-          <w:szCs w:val="22"/>
-        </w:rPr>
-        <w:t xml:space="preserve">Porque ya está cubierto del todo por algún vínculo, o porque su unidad de medida no coincide con la del filtro de renglones y el producto no tiene una equivalencia cargada (ver sección 4).</w:t>
+        <w:t xml:space="preserve">¿Por qué un movimiento o un renglón no aparece en la lista de pendientes?</w:t>
+      </w:r>
+    </w:p>
+    <w:p>
+      <w:pPr>
+        <w:spacing w:after="160" w:line="300"/>
+      </w:pPr>
+      <w:r>
+        <w:rPr>
+          <w:sz w:val="22"/>
+          <w:szCs w:val="22"/>
+        </w:rPr>
+        <w:t xml:space="preserve">Porque ya está cubierto del todo por algún vínculo, o porque su unidad de medida no coincide con la del otro lado (movimiento vs. renglón) y el producto no tiene una equivalencia cargada para esa unidad (ver sección 4).</w:t>
       </w:r>
     </w:p>
     <w:p>

</xml_diff>